<commit_message>
Fixed person-person bs doc
</commit_message>
<xml_diff>
--- a/documents/templates/5_bs_person_person(ДКП (Универсальный)).docx
+++ b/documents/templates/5_bs_person_person(ДКП (Универсальный)).docx
@@ -559,6 +559,7 @@
                 <w:lang w:val="en-US"/>
               </w:rPr>
             </w:pPr>
+            <w:proofErr w:type="gramStart"/>
             <w:r>
               <w:rPr>
                 <w:rFonts w:cs="Calibri"/>
@@ -580,7 +581,19 @@
                 <w:szCs w:val="20"/>
                 <w:lang w:val="en-US"/>
               </w:rPr>
-              <w:t>buyer_last_name</w:t>
+              <w:t>buyer</w:t>
+            </w:r>
+            <w:proofErr w:type="gramEnd"/>
+            <w:r>
+              <w:rPr>
+                <w:rFonts w:cs="Calibri"/>
+                <w:bCs/>
+                <w:color w:val="000000"/>
+                <w:sz w:val="20"/>
+                <w:szCs w:val="20"/>
+                <w:lang w:val="en-US"/>
+              </w:rPr>
+              <w:t>_last_name</w:t>
             </w:r>
             <w:proofErr w:type="spellEnd"/>
             <w:r>
@@ -1585,6 +1598,7 @@
                 <w:lang w:val="en-US"/>
               </w:rPr>
             </w:pPr>
+            <w:proofErr w:type="gramStart"/>
             <w:r>
               <w:rPr>
                 <w:rFonts w:cs="Calibri"/>
@@ -1608,6 +1622,7 @@
               </w:rPr>
               <w:t>seller</w:t>
             </w:r>
+            <w:proofErr w:type="gramEnd"/>
             <w:r>
               <w:rPr>
                 <w:rFonts w:cs="Calibri"/>
@@ -3825,7 +3840,27 @@
                 <w:szCs w:val="24"/>
                 <w:lang w:val="en-US"/>
               </w:rPr>
-              <w:t xml:space="preserve"> %}{{ </w:t>
+              <w:t xml:space="preserve"> </w:t>
+            </w:r>
+            <w:proofErr w:type="gramStart"/>
+            <w:r>
+              <w:rPr>
+                <w:rFonts w:cs="Calibri"/>
+                <w:sz w:val="24"/>
+                <w:szCs w:val="24"/>
+                <w:lang w:val="en-US"/>
+              </w:rPr>
+              <w:t>%}{</w:t>
+            </w:r>
+            <w:proofErr w:type="gramEnd"/>
+            <w:r>
+              <w:rPr>
+                <w:rFonts w:cs="Calibri"/>
+                <w:sz w:val="24"/>
+                <w:szCs w:val="24"/>
+                <w:lang w:val="en-US"/>
+              </w:rPr>
+              <w:t xml:space="preserve">{ </w:t>
             </w:r>
             <w:proofErr w:type="spellStart"/>
             <w:r>
@@ -4001,7 +4036,27 @@
                 <w:szCs w:val="24"/>
                 <w:lang w:val="en-US"/>
               </w:rPr>
-              <w:t xml:space="preserve"> %}{{</w:t>
+              <w:t xml:space="preserve"> </w:t>
+            </w:r>
+            <w:proofErr w:type="gramStart"/>
+            <w:r>
+              <w:rPr>
+                <w:rFonts w:cs="Calibri"/>
+                <w:sz w:val="24"/>
+                <w:szCs w:val="24"/>
+                <w:lang w:val="en-US"/>
+              </w:rPr>
+              <w:t>%}{</w:t>
+            </w:r>
+            <w:proofErr w:type="gramEnd"/>
+            <w:r>
+              <w:rPr>
+                <w:rFonts w:cs="Calibri"/>
+                <w:sz w:val="24"/>
+                <w:szCs w:val="24"/>
+                <w:lang w:val="en-US"/>
+              </w:rPr>
+              <w:t>{</w:t>
             </w:r>
             <w:proofErr w:type="spellStart"/>
             <w:r>
@@ -4819,7 +4874,6 @@
           <w:color w:val="000000"/>
           <w:sz w:val="20"/>
           <w:szCs w:val="20"/>
-          <w:lang w:val="en-US"/>
         </w:rPr>
       </w:pPr>
       <w:r>
@@ -4846,7 +4900,6 @@
           <w:color w:val="000000"/>
           <w:sz w:val="20"/>
           <w:szCs w:val="20"/>
-          <w:lang w:val="en-US"/>
         </w:rPr>
         <w:t>:</w:t>
       </w:r>
@@ -4856,7 +4909,6 @@
           <w:color w:val="000000"/>
           <w:sz w:val="20"/>
           <w:szCs w:val="20"/>
-          <w:lang w:val="en-US"/>
         </w:rPr>
         <w:t xml:space="preserve"> </w:t>
       </w:r>
@@ -4866,7 +4918,6 @@
           <w:color w:val="000000"/>
           <w:sz w:val="24"/>
           <w:szCs w:val="24"/>
-          <w:lang w:val="en-US"/>
         </w:rPr>
         <w:t>__________________/</w:t>
       </w:r>
@@ -4876,9 +4927,33 @@
           <w:color w:val="000000"/>
           <w:sz w:val="24"/>
           <w:szCs w:val="24"/>
+        </w:rPr>
+        <w:t xml:space="preserve"> </w:t>
+      </w:r>
+      <w:r>
+        <w:rPr>
+          <w:color w:val="000000"/>
+          <w:sz w:val="20"/>
+          <w:szCs w:val="20"/>
+        </w:rPr>
+        <w:t>{{</w:t>
+      </w:r>
+      <w:r>
+        <w:rPr>
+          <w:color w:val="000000"/>
+          <w:sz w:val="20"/>
+          <w:szCs w:val="20"/>
           <w:lang w:val="en-US"/>
         </w:rPr>
-        <w:t xml:space="preserve"> </w:t>
+        <w:t>seller</w:t>
+      </w:r>
+      <w:r>
+        <w:rPr>
+          <w:color w:val="000000"/>
+          <w:sz w:val="20"/>
+          <w:szCs w:val="20"/>
+        </w:rPr>
+        <w:t>_</w:t>
       </w:r>
       <w:r>
         <w:rPr>
@@ -4887,25 +4962,13 @@
           <w:szCs w:val="20"/>
           <w:lang w:val="en-US"/>
         </w:rPr>
-        <w:t>{{</w:t>
-      </w:r>
-      <w:proofErr w:type="spellStart"/>
-      <w:r>
-        <w:rPr>
-          <w:color w:val="000000"/>
-          <w:sz w:val="20"/>
-          <w:szCs w:val="20"/>
-          <w:lang w:val="en-US"/>
-        </w:rPr>
-        <w:t>seller_initials</w:t>
-      </w:r>
-      <w:proofErr w:type="spellEnd"/>
-      <w:r>
-        <w:rPr>
-          <w:color w:val="000000"/>
-          <w:sz w:val="20"/>
-          <w:szCs w:val="20"/>
-          <w:lang w:val="en-US"/>
+        <w:t>initials</w:t>
+      </w:r>
+      <w:r>
+        <w:rPr>
+          <w:color w:val="000000"/>
+          <w:sz w:val="20"/>
+          <w:szCs w:val="20"/>
         </w:rPr>
         <w:t>}}</w:t>
       </w:r>
@@ -4914,7 +4977,6 @@
           <w:color w:val="000000"/>
           <w:sz w:val="20"/>
           <w:szCs w:val="20"/>
-          <w:lang w:val="en-US"/>
         </w:rPr>
         <w:t xml:space="preserve"> </w:t>
       </w:r>
@@ -4924,7 +4986,6 @@
           <w:color w:val="000000"/>
           <w:sz w:val="24"/>
           <w:szCs w:val="24"/>
-          <w:lang w:val="en-US"/>
         </w:rPr>
         <w:t>/</w:t>
       </w:r>
@@ -4937,10 +4998,12 @@
           <w:color w:val="000000"/>
           <w:sz w:val="24"/>
           <w:szCs w:val="24"/>
-          <w:lang w:val="en-US"/>
         </w:rPr>
       </w:pPr>
-      <w:r>
+    </w:p>
+    <w:p>
+      <w:pPr>
+        <w:spacing w:after="0" w:line="240" w:lineRule="auto"/>
         <w:rPr>
           <w:rFonts w:cs="Calibri"/>
           <w:color w:val="000000"/>
@@ -4948,8 +5011,19 @@
           <w:szCs w:val="24"/>
           <w:lang w:val="en-US"/>
         </w:rPr>
-        <w:br w:type="page"/>
-      </w:r>
+      </w:pPr>
+    </w:p>
+    <w:p>
+      <w:pPr>
+        <w:spacing w:after="0" w:line="240" w:lineRule="auto"/>
+        <w:rPr>
+          <w:rFonts w:cs="Calibri"/>
+          <w:color w:val="000000"/>
+          <w:sz w:val="24"/>
+          <w:szCs w:val="24"/>
+          <w:lang w:val="en-US"/>
+        </w:rPr>
+      </w:pPr>
     </w:p>
     <w:p>
       <w:pPr>
@@ -4974,7 +5048,6 @@
           <w:sz w:val="24"/>
           <w:szCs w:val="24"/>
         </w:rPr>
-        <w:lastRenderedPageBreak/>
         <w:t>Акт Приема-Передачи ТС</w:t>
       </w:r>
       <w:r>

</xml_diff>